<commit_message>
Modulo 3: actualizar Resultados provisorios con entrevistas 08-13 (13/15) e insights de integracion de datos y capa de organizacion
</commit_message>
<xml_diff>
--- a/Modulo 3 - El cliente/Entrega/Resultados provisorios entrevistas y encuesta.docx
+++ b/Modulo 3 - El cliente/Entrega/Resultados provisorios entrevistas y encuesta.docx
@@ -149,7 +149,7 @@
           <w:sz w:val="24"/>
           <w:szCs w:val="24"/>
         </w:rPr>
-        <w:t xml:space="preserve">Este documento reúne el estado provisorio del trabajo de campo del Módulo 3 al 19 de junio de 2026: las entrevistas de empatía realizadas hasta la fecha y la encuesta cuantitativa de validación. No es la entrega final del módulo, sino el insumo para completar la Sección 4 (proceso de validación) del entregable y para discutir con el mentor antes de cerrar el perfil y el arquetipo. Las cifras y conclusiones son preliminares: la regla del NBL exige un mínimo de 15 entrevistas B2C y a la fecha hay 7 cargadas; la encuesta es una muestra de conveniencia (60 respuestas) y no es estadísticamente representativa.</w:t>
+        <w:t xml:space="preserve">Este documento reúne el estado provisorio del trabajo de campo del Módulo 3 al 19 de junio de 2026: las entrevistas de empatía realizadas hasta la fecha y la encuesta cuantitativa de validación. No es la entrega final del módulo, sino el insumo para completar la Sección 4 (proceso de validación) del entregable y para discutir con el mentor antes de cerrar el perfil y el arquetipo. Las cifras y conclusiones son preliminares: la regla del NBL exige un mínimo de 15 entrevistas B2C y a la fecha hay 13 cargadas; la encuesta es una muestra de conveniencia (60 respuestas) y no es estadísticamente representativa.</w:t>
       </w:r>
     </w:p>
     <w:p>
@@ -372,7 +372,7 @@
                 <w:sz w:val="21"/>
                 <w:szCs w:val="21"/>
               </w:rPr>
-              <w:t xml:space="preserve">7 cargadas y limpiadas</w:t>
+              <w:t xml:space="preserve">13 cargadas y limpiadas</w:t>
             </w:r>
           </w:p>
         </w:tc>
@@ -527,7 +527,7 @@
           <w:sz w:val="24"/>
           <w:szCs w:val="24"/>
         </w:rPr>
-        <w:t xml:space="preserve">Las siete entrevistas fueron conducidas por la dupla (Nico y Benja), grabadas, desgrabadas y normalizadas con una ficha de contexto y notas frente a las hipótesis. La encuesta —“Cómo entrenás y tomás tus decisiones”— recogió 60 respuestas y cubre deporte, frecuencia, uso de wearables, conducta de decisión diaria, gasto, disposición a pagar y apertura a una interfaz conversacional.</w:t>
+        <w:t xml:space="preserve">Las trece entrevistas fueron conducidas por la dupla (Nico y Benja), grabadas, desgrabadas y normalizadas con una ficha de contexto y notas frente a las hipótesis. La encuesta —“Cómo entrenás y tomás tus decisiones”— recogió 60 respuestas y cubre deporte, frecuencia, uso de wearables, conducta de decisión diaria, gasto, disposición a pagar y apertura a una interfaz conversacional.</w:t>
       </w:r>
     </w:p>
     <w:p>
@@ -2736,7 +2736,7 @@
           <w:sz w:val="28"/>
           <w:szCs w:val="28"/>
         </w:rPr>
-        <w:t xml:space="preserve">3. Resultados de las entrevistas (7 de 15)</w:t>
+        <w:t xml:space="preserve">3. Resultados de las entrevistas (13 de 15)</w:t>
       </w:r>
     </w:p>
     <w:p>
@@ -2751,7 +2751,7 @@
           <w:sz w:val="24"/>
           <w:szCs w:val="24"/>
         </w:rPr>
-        <w:t xml:space="preserve">Las siete entrevistas cubren un rango deliberadamente variado de perfiles —de gimnasio, raqueta, natación, fútbol, golf y running; con y sin wearable; cuatro mujeres y tres varones; con y sin coach— para mapear el segmento antes de profundizar en el target. La tabla siguiente sintetiza cada caso.</w:t>
+        <w:t xml:space="preserve">Las trece entrevistas cubren un rango deliberadamente variado de perfiles —de gimnasio, raqueta, natación, fútbol, golf, running/trail y pilates; con y sin wearable (incluye dos power users de datos); seis mujeres y siete varones; con y sin coach— para mapear el segmento antes de profundizar en el target. La tabla siguiente sintetiza cada caso.</w:t>
       </w:r>
     </w:p>
     <w:tbl>
@@ -3868,6 +3868,828 @@
           </w:p>
         </w:tc>
       </w:tr>
+      <w:tr>
+        <w:trPr>
+          <w:tblHeader w:val="false"/>
+        </w:trPr>
+        <w:tc>
+          <w:tcPr>
+            <w:tcW w:type="dxa" w:w="1900"/>
+            <w:tcBorders>
+              <w:top w:val="single" w:color="888888" w:sz="1"/>
+              <w:left w:val="single" w:color="888888" w:sz="1"/>
+              <w:bottom w:val="single" w:color="888888" w:sz="1"/>
+              <w:right w:val="single" w:color="888888" w:sz="1"/>
+            </w:tcBorders>
+            <w:tcMar>
+              <w:top w:type="dxa" w:w="60"/>
+              <w:left w:type="dxa" w:w="110"/>
+              <w:bottom w:type="dxa" w:w="60"/>
+              <w:right w:type="dxa" w:w="110"/>
+            </w:tcMar>
+          </w:tcPr>
+          <w:p>
+            <w:pPr>
+              <w:spacing w:after="0" w:line="280"/>
+            </w:pPr>
+            <w:r>
+              <w:rPr>
+                <w:rFonts w:ascii="Arial" w:cs="Arial" w:eastAsia="Arial" w:hAnsi="Arial"/>
+                <w:b w:val="false"/>
+                <w:bCs w:val="false"/>
+                <w:color w:val="000000"/>
+                <w:sz w:val="21"/>
+                <w:szCs w:val="21"/>
+              </w:rPr>
+              <w:t xml:space="preserve">08 · Matías Tahta</w:t>
+            </w:r>
+          </w:p>
+        </w:tc>
+        <w:tc>
+          <w:tcPr>
+            <w:tcW w:type="dxa" w:w="2150"/>
+            <w:tcBorders>
+              <w:top w:val="single" w:color="888888" w:sz="1"/>
+              <w:left w:val="single" w:color="888888" w:sz="1"/>
+              <w:bottom w:val="single" w:color="888888" w:sz="1"/>
+              <w:right w:val="single" w:color="888888" w:sz="1"/>
+            </w:tcBorders>
+            <w:tcMar>
+              <w:top w:type="dxa" w:w="60"/>
+              <w:left w:type="dxa" w:w="110"/>
+              <w:bottom w:type="dxa" w:w="60"/>
+              <w:right w:type="dxa" w:w="110"/>
+            </w:tcMar>
+          </w:tcPr>
+          <w:p>
+            <w:pPr>
+              <w:spacing w:after="0" w:line="280"/>
+            </w:pPr>
+            <w:r>
+              <w:rPr>
+                <w:rFonts w:ascii="Arial" w:cs="Arial" w:eastAsia="Arial" w:hAnsi="Arial"/>
+                <w:b w:val="false"/>
+                <w:bCs w:val="false"/>
+                <w:color w:val="000000"/>
+                <w:sz w:val="21"/>
+                <w:szCs w:val="21"/>
+              </w:rPr>
+              <w:t xml:space="preserve">Running/trail (El Cruce, Maratón BA); gimnasio 1x/sem; Garmin Fénix 5</w:t>
+            </w:r>
+          </w:p>
+        </w:tc>
+        <w:tc>
+          <w:tcPr>
+            <w:tcW w:type="dxa" w:w="2454"/>
+            <w:tcBorders>
+              <w:top w:val="single" w:color="888888" w:sz="1"/>
+              <w:left w:val="single" w:color="888888" w:sz="1"/>
+              <w:bottom w:val="single" w:color="888888" w:sz="1"/>
+              <w:right w:val="single" w:color="888888" w:sz="1"/>
+            </w:tcBorders>
+            <w:tcMar>
+              <w:top w:type="dxa" w:w="60"/>
+              <w:left w:type="dxa" w:w="110"/>
+              <w:bottom w:type="dxa" w:w="60"/>
+              <w:right w:type="dxa" w:w="110"/>
+            </w:tcMar>
+          </w:tcPr>
+          <w:p>
+            <w:pPr>
+              <w:spacing w:after="0" w:line="280"/>
+            </w:pPr>
+            <w:r>
+              <w:rPr>
+                <w:rFonts w:ascii="Arial" w:cs="Arial" w:eastAsia="Arial" w:hAnsi="Arial"/>
+                <w:b w:val="false"/>
+                <w:bCs w:val="false"/>
+                <w:color w:val="000000"/>
+                <w:sz w:val="21"/>
+                <w:szCs w:val="21"/>
+              </w:rPr>
+              <w:t xml:space="preserve">Decide por sensación + sueño + estrés; mira HR y ritmo pero no cruza los datos entre sí</w:t>
+            </w:r>
+          </w:p>
+        </w:tc>
+        <w:tc>
+          <w:tcPr>
+            <w:tcW w:type="dxa" w:w="2000"/>
+            <w:tcBorders>
+              <w:top w:val="single" w:color="888888" w:sz="1"/>
+              <w:left w:val="single" w:color="888888" w:sz="1"/>
+              <w:bottom w:val="single" w:color="888888" w:sz="1"/>
+              <w:right w:val="single" w:color="888888" w:sz="1"/>
+            </w:tcBorders>
+            <w:tcMar>
+              <w:top w:type="dxa" w:w="60"/>
+              <w:left w:type="dxa" w:w="110"/>
+              <w:bottom w:type="dxa" w:w="60"/>
+              <w:right w:type="dxa" w:w="110"/>
+            </w:tcMar>
+          </w:tcPr>
+          <w:p>
+            <w:pPr>
+              <w:spacing w:after="0" w:line="280"/>
+            </w:pPr>
+            <w:r>
+              <w:rPr>
+                <w:rFonts w:ascii="Arial" w:cs="Arial" w:eastAsia="Arial" w:hAnsi="Arial"/>
+                <w:b w:val="false"/>
+                <w:bCs w:val="false"/>
+                <w:color w:val="000000"/>
+                <w:sz w:val="21"/>
+                <w:szCs w:val="21"/>
+              </w:rPr>
+              <w:t xml:space="preserve">Tiene wearable y sí acciona sueño, pero pide que la IA cruce/traduzca datos (ej. performance por calzado); pagaría por plan tailor + análisis profundo</w:t>
+            </w:r>
+          </w:p>
+        </w:tc>
+      </w:tr>
+      <w:tr>
+        <w:trPr>
+          <w:tblHeader w:val="false"/>
+        </w:trPr>
+        <w:tc>
+          <w:tcPr>
+            <w:tcW w:type="dxa" w:w="1900"/>
+            <w:tcBorders>
+              <w:top w:val="single" w:color="888888" w:sz="1"/>
+              <w:left w:val="single" w:color="888888" w:sz="1"/>
+              <w:bottom w:val="single" w:color="888888" w:sz="1"/>
+              <w:right w:val="single" w:color="888888" w:sz="1"/>
+            </w:tcBorders>
+            <w:tcMar>
+              <w:top w:type="dxa" w:w="60"/>
+              <w:left w:type="dxa" w:w="110"/>
+              <w:bottom w:type="dxa" w:w="60"/>
+              <w:right w:type="dxa" w:w="110"/>
+            </w:tcMar>
+          </w:tcPr>
+          <w:p>
+            <w:pPr>
+              <w:spacing w:after="0" w:line="280"/>
+            </w:pPr>
+            <w:r>
+              <w:rPr>
+                <w:rFonts w:ascii="Arial" w:cs="Arial" w:eastAsia="Arial" w:hAnsi="Arial"/>
+                <w:b w:val="false"/>
+                <w:bCs w:val="false"/>
+                <w:color w:val="000000"/>
+                <w:sz w:val="21"/>
+                <w:szCs w:val="21"/>
+              </w:rPr>
+              <w:t xml:space="preserve">09 · Hernán de la Cárcova</w:t>
+            </w:r>
+          </w:p>
+        </w:tc>
+        <w:tc>
+          <w:tcPr>
+            <w:tcW w:type="dxa" w:w="2150"/>
+            <w:tcBorders>
+              <w:top w:val="single" w:color="888888" w:sz="1"/>
+              <w:left w:val="single" w:color="888888" w:sz="1"/>
+              <w:bottom w:val="single" w:color="888888" w:sz="1"/>
+              <w:right w:val="single" w:color="888888" w:sz="1"/>
+            </w:tcBorders>
+            <w:tcMar>
+              <w:top w:type="dxa" w:w="60"/>
+              <w:left w:type="dxa" w:w="110"/>
+              <w:bottom w:type="dxa" w:w="60"/>
+              <w:right w:type="dxa" w:w="110"/>
+            </w:tcMar>
+          </w:tcPr>
+          <w:p>
+            <w:pPr>
+              <w:spacing w:after="0" w:line="280"/>
+            </w:pPr>
+            <w:r>
+              <w:rPr>
+                <w:rFonts w:ascii="Arial" w:cs="Arial" w:eastAsia="Arial" w:hAnsi="Arial"/>
+                <w:b w:val="false"/>
+                <w:bCs w:val="false"/>
+                <w:color w:val="000000"/>
+                <w:sz w:val="21"/>
+                <w:szCs w:val="21"/>
+              </w:rPr>
+              <w:t xml:space="preserve">Running (8 maratones), tenis, gimnasio, deportes de agua; Garmin Instinct + ex Oura</w:t>
+            </w:r>
+          </w:p>
+        </w:tc>
+        <w:tc>
+          <w:tcPr>
+            <w:tcW w:type="dxa" w:w="2454"/>
+            <w:tcBorders>
+              <w:top w:val="single" w:color="888888" w:sz="1"/>
+              <w:left w:val="single" w:color="888888" w:sz="1"/>
+              <w:bottom w:val="single" w:color="888888" w:sz="1"/>
+              <w:right w:val="single" w:color="888888" w:sz="1"/>
+            </w:tcBorders>
+            <w:tcMar>
+              <w:top w:type="dxa" w:w="60"/>
+              <w:left w:type="dxa" w:w="110"/>
+              <w:bottom w:type="dxa" w:w="60"/>
+              <w:right w:type="dxa" w:w="110"/>
+            </w:tcMar>
+          </w:tcPr>
+          <w:p>
+            <w:pPr>
+              <w:spacing w:after="0" w:line="280"/>
+            </w:pPr>
+            <w:r>
+              <w:rPr>
+                <w:rFonts w:ascii="Arial" w:cs="Arial" w:eastAsia="Arial" w:hAnsi="Arial"/>
+                <w:b w:val="false"/>
+                <w:bCs w:val="false"/>
+                <w:color w:val="000000"/>
+                <w:sz w:val="21"/>
+                <w:szCs w:val="21"/>
+              </w:rPr>
+              <w:t xml:space="preserve">Power user de datos (HRV, sueño, recuperación); sube capturas de pantalla a un chat de IA para analizar e integrar su histórico</w:t>
+            </w:r>
+          </w:p>
+        </w:tc>
+        <w:tc>
+          <w:tcPr>
+            <w:tcW w:type="dxa" w:w="2000"/>
+            <w:tcBorders>
+              <w:top w:val="single" w:color="888888" w:sz="1"/>
+              <w:left w:val="single" w:color="888888" w:sz="1"/>
+              <w:bottom w:val="single" w:color="888888" w:sz="1"/>
+              <w:right w:val="single" w:color="888888" w:sz="1"/>
+            </w:tcBorders>
+            <w:tcMar>
+              <w:top w:type="dxa" w:w="60"/>
+              <w:left w:type="dxa" w:w="110"/>
+              <w:bottom w:type="dxa" w:w="60"/>
+              <w:right w:type="dxa" w:w="110"/>
+            </w:tcMar>
+          </w:tcPr>
+          <w:p>
+            <w:pPr>
+              <w:spacing w:after="0" w:line="280"/>
+            </w:pPr>
+            <w:r>
+              <w:rPr>
+                <w:rFonts w:ascii="Arial" w:cs="Arial" w:eastAsia="Arial" w:hAnsi="Arial"/>
+                <w:b w:val="false"/>
+                <w:bCs w:val="false"/>
+                <w:color w:val="000000"/>
+                <w:sz w:val="21"/>
+                <w:szCs w:val="21"/>
+              </w:rPr>
+              <w:t xml:space="preserve">Candidato a beta tester; valida la fricción de integración manual de datos como el pain central y la visión multi-dispositivo</w:t>
+            </w:r>
+          </w:p>
+        </w:tc>
+      </w:tr>
+      <w:tr>
+        <w:trPr>
+          <w:tblHeader w:val="false"/>
+        </w:trPr>
+        <w:tc>
+          <w:tcPr>
+            <w:tcW w:type="dxa" w:w="1900"/>
+            <w:tcBorders>
+              <w:top w:val="single" w:color="888888" w:sz="1"/>
+              <w:left w:val="single" w:color="888888" w:sz="1"/>
+              <w:bottom w:val="single" w:color="888888" w:sz="1"/>
+              <w:right w:val="single" w:color="888888" w:sz="1"/>
+            </w:tcBorders>
+            <w:tcMar>
+              <w:top w:type="dxa" w:w="60"/>
+              <w:left w:type="dxa" w:w="110"/>
+              <w:bottom w:type="dxa" w:w="60"/>
+              <w:right w:type="dxa" w:w="110"/>
+            </w:tcMar>
+          </w:tcPr>
+          <w:p>
+            <w:pPr>
+              <w:spacing w:after="0" w:line="280"/>
+            </w:pPr>
+            <w:r>
+              <w:rPr>
+                <w:rFonts w:ascii="Arial" w:cs="Arial" w:eastAsia="Arial" w:hAnsi="Arial"/>
+                <w:b w:val="false"/>
+                <w:bCs w:val="false"/>
+                <w:color w:val="000000"/>
+                <w:sz w:val="21"/>
+                <w:szCs w:val="21"/>
+              </w:rPr>
+              <w:t xml:space="preserve">10 · Maitena Galíndez</w:t>
+            </w:r>
+          </w:p>
+        </w:tc>
+        <w:tc>
+          <w:tcPr>
+            <w:tcW w:type="dxa" w:w="2150"/>
+            <w:tcBorders>
+              <w:top w:val="single" w:color="888888" w:sz="1"/>
+              <w:left w:val="single" w:color="888888" w:sz="1"/>
+              <w:bottom w:val="single" w:color="888888" w:sz="1"/>
+              <w:right w:val="single" w:color="888888" w:sz="1"/>
+            </w:tcBorders>
+            <w:tcMar>
+              <w:top w:type="dxa" w:w="60"/>
+              <w:left w:type="dxa" w:w="110"/>
+              <w:bottom w:type="dxa" w:w="60"/>
+              <w:right w:type="dxa" w:w="110"/>
+            </w:tcMar>
+          </w:tcPr>
+          <w:p>
+            <w:pPr>
+              <w:spacing w:after="0" w:line="280"/>
+            </w:pPr>
+            <w:r>
+              <w:rPr>
+                <w:rFonts w:ascii="Arial" w:cs="Arial" w:eastAsia="Arial" w:hAnsi="Arial"/>
+                <w:b w:val="false"/>
+                <w:bCs w:val="false"/>
+                <w:color w:val="000000"/>
+                <w:sz w:val="21"/>
+                <w:szCs w:val="21"/>
+              </w:rPr>
+              <w:t xml:space="preserve">Gimnasio/fuerza y yoga (hoy inactiva); sin wearable; ciclo muy relevante</w:t>
+            </w:r>
+          </w:p>
+        </w:tc>
+        <w:tc>
+          <w:tcPr>
+            <w:tcW w:type="dxa" w:w="2454"/>
+            <w:tcBorders>
+              <w:top w:val="single" w:color="888888" w:sz="1"/>
+              <w:left w:val="single" w:color="888888" w:sz="1"/>
+              <w:bottom w:val="single" w:color="888888" w:sz="1"/>
+              <w:right w:val="single" w:color="888888" w:sz="1"/>
+            </w:tcBorders>
+            <w:tcMar>
+              <w:top w:type="dxa" w:w="60"/>
+              <w:left w:type="dxa" w:w="110"/>
+              <w:bottom w:type="dxa" w:w="60"/>
+              <w:right w:type="dxa" w:w="110"/>
+            </w:tcMar>
+          </w:tcPr>
+          <w:p>
+            <w:pPr>
+              <w:spacing w:after="0" w:line="280"/>
+            </w:pPr>
+            <w:r>
+              <w:rPr>
+                <w:rFonts w:ascii="Arial" w:cs="Arial" w:eastAsia="Arial" w:hAnsi="Arial"/>
+                <w:b w:val="false"/>
+                <w:bCs w:val="false"/>
+                <w:color w:val="000000"/>
+                <w:sz w:val="21"/>
+                <w:szCs w:val="21"/>
+              </w:rPr>
+              <w:t xml:space="preserve">Decide por sensación y ciclo (“cien por ciento cambia” mi energía); valora el vínculo humano y la comunidad del gimnasio</w:t>
+            </w:r>
+          </w:p>
+        </w:tc>
+        <w:tc>
+          <w:tcPr>
+            <w:tcW w:type="dxa" w:w="2000"/>
+            <w:tcBorders>
+              <w:top w:val="single" w:color="888888" w:sz="1"/>
+              <w:left w:val="single" w:color="888888" w:sz="1"/>
+              <w:bottom w:val="single" w:color="888888" w:sz="1"/>
+              <w:right w:val="single" w:color="888888" w:sz="1"/>
+            </w:tcBorders>
+            <w:tcMar>
+              <w:top w:type="dxa" w:w="60"/>
+              <w:left w:type="dxa" w:w="110"/>
+              <w:bottom w:type="dxa" w:w="60"/>
+              <w:right w:type="dxa" w:w="110"/>
+            </w:tcMar>
+          </w:tcPr>
+          <w:p>
+            <w:pPr>
+              <w:spacing w:after="0" w:line="280"/>
+            </w:pPr>
+            <w:r>
+              <w:rPr>
+                <w:rFonts w:ascii="Arial" w:cs="Arial" w:eastAsia="Arial" w:hAnsi="Arial"/>
+                <w:b w:val="false"/>
+                <w:bCs w:val="false"/>
+                <w:color w:val="000000"/>
+                <w:sz w:val="21"/>
+                <w:szCs w:val="21"/>
+              </w:rPr>
+              <w:t xml:space="preserve">Valida fuerte el sub-segmento ciclo; NO reemplazaría el coach humano pero sí usaría la IA como capa de organización (entrenamiento + comidas + recordatorios)</w:t>
+            </w:r>
+          </w:p>
+        </w:tc>
+      </w:tr>
+      <w:tr>
+        <w:trPr>
+          <w:tblHeader w:val="false"/>
+        </w:trPr>
+        <w:tc>
+          <w:tcPr>
+            <w:tcW w:type="dxa" w:w="1900"/>
+            <w:tcBorders>
+              <w:top w:val="single" w:color="888888" w:sz="1"/>
+              <w:left w:val="single" w:color="888888" w:sz="1"/>
+              <w:bottom w:val="single" w:color="888888" w:sz="1"/>
+              <w:right w:val="single" w:color="888888" w:sz="1"/>
+            </w:tcBorders>
+            <w:tcMar>
+              <w:top w:type="dxa" w:w="60"/>
+              <w:left w:type="dxa" w:w="110"/>
+              <w:bottom w:type="dxa" w:w="60"/>
+              <w:right w:type="dxa" w:w="110"/>
+            </w:tcMar>
+          </w:tcPr>
+          <w:p>
+            <w:pPr>
+              <w:spacing w:after="0" w:line="280"/>
+            </w:pPr>
+            <w:r>
+              <w:rPr>
+                <w:rFonts w:ascii="Arial" w:cs="Arial" w:eastAsia="Arial" w:hAnsi="Arial"/>
+                <w:b w:val="false"/>
+                <w:bCs w:val="false"/>
+                <w:color w:val="000000"/>
+                <w:sz w:val="21"/>
+                <w:szCs w:val="21"/>
+              </w:rPr>
+              <w:t xml:space="preserve">11 · Graciela Bopolo</w:t>
+            </w:r>
+          </w:p>
+        </w:tc>
+        <w:tc>
+          <w:tcPr>
+            <w:tcW w:type="dxa" w:w="2150"/>
+            <w:tcBorders>
+              <w:top w:val="single" w:color="888888" w:sz="1"/>
+              <w:left w:val="single" w:color="888888" w:sz="1"/>
+              <w:bottom w:val="single" w:color="888888" w:sz="1"/>
+              <w:right w:val="single" w:color="888888" w:sz="1"/>
+            </w:tcBorders>
+            <w:tcMar>
+              <w:top w:type="dxa" w:w="60"/>
+              <w:left w:type="dxa" w:w="110"/>
+              <w:bottom w:type="dxa" w:w="60"/>
+              <w:right w:type="dxa" w:w="110"/>
+            </w:tcMar>
+          </w:tcPr>
+          <w:p>
+            <w:pPr>
+              <w:spacing w:after="0" w:line="280"/>
+            </w:pPr>
+            <w:r>
+              <w:rPr>
+                <w:rFonts w:ascii="Arial" w:cs="Arial" w:eastAsia="Arial" w:hAnsi="Arial"/>
+                <w:b w:val="false"/>
+                <w:bCs w:val="false"/>
+                <w:color w:val="000000"/>
+                <w:sz w:val="21"/>
+                <w:szCs w:val="21"/>
+              </w:rPr>
+              <w:t xml:space="preserve">Gimnasio (fuerza) 4x/sem con entrenadora; sin wearable propio (lo lleva la profesora)</w:t>
+            </w:r>
+          </w:p>
+        </w:tc>
+        <w:tc>
+          <w:tcPr>
+            <w:tcW w:type="dxa" w:w="2454"/>
+            <w:tcBorders>
+              <w:top w:val="single" w:color="888888" w:sz="1"/>
+              <w:left w:val="single" w:color="888888" w:sz="1"/>
+              <w:bottom w:val="single" w:color="888888" w:sz="1"/>
+              <w:right w:val="single" w:color="888888" w:sz="1"/>
+            </w:tcBorders>
+            <w:tcMar>
+              <w:top w:type="dxa" w:w="60"/>
+              <w:left w:type="dxa" w:w="110"/>
+              <w:bottom w:type="dxa" w:w="60"/>
+              <w:right w:type="dxa" w:w="110"/>
+            </w:tcMar>
+          </w:tcPr>
+          <w:p>
+            <w:pPr>
+              <w:spacing w:after="0" w:line="280"/>
+            </w:pPr>
+            <w:r>
+              <w:rPr>
+                <w:rFonts w:ascii="Arial" w:cs="Arial" w:eastAsia="Arial" w:hAnsi="Arial"/>
+                <w:b w:val="false"/>
+                <w:bCs w:val="false"/>
+                <w:color w:val="000000"/>
+                <w:sz w:val="21"/>
+                <w:szCs w:val="21"/>
+              </w:rPr>
+              <w:t xml:space="preserve">Delega todo el orden a la entrenadora; “nunca tengo ganas” pero entrena por autoexigencia y por estar pagando</w:t>
+            </w:r>
+          </w:p>
+        </w:tc>
+        <w:tc>
+          <w:tcPr>
+            <w:tcW w:type="dxa" w:w="2000"/>
+            <w:tcBorders>
+              <w:top w:val="single" w:color="888888" w:sz="1"/>
+              <w:left w:val="single" w:color="888888" w:sz="1"/>
+              <w:bottom w:val="single" w:color="888888" w:sz="1"/>
+              <w:right w:val="single" w:color="888888" w:sz="1"/>
+            </w:tcBorders>
+            <w:tcMar>
+              <w:top w:type="dxa" w:w="60"/>
+              <w:left w:type="dxa" w:w="110"/>
+              <w:bottom w:type="dxa" w:w="60"/>
+              <w:right w:type="dxa" w:w="110"/>
+            </w:tcMar>
+          </w:tcPr>
+          <w:p>
+            <w:pPr>
+              <w:spacing w:after="0" w:line="280"/>
+            </w:pPr>
+            <w:r>
+              <w:rPr>
+                <w:rFonts w:ascii="Arial" w:cs="Arial" w:eastAsia="Arial" w:hAnsi="Arial"/>
+                <w:b w:val="false"/>
+                <w:bCs w:val="false"/>
+                <w:color w:val="000000"/>
+                <w:sz w:val="21"/>
+                <w:szCs w:val="21"/>
+              </w:rPr>
+              <w:t xml:space="preserve">Pide simplicidad radical (alimentos accesibles, sin tecnicismos) y parámetros razonables sin mediciones invasivas (%grasa); desconfía de exigencias poco realistas</w:t>
+            </w:r>
+          </w:p>
+        </w:tc>
+      </w:tr>
+      <w:tr>
+        <w:trPr>
+          <w:tblHeader w:val="false"/>
+        </w:trPr>
+        <w:tc>
+          <w:tcPr>
+            <w:tcW w:type="dxa" w:w="1900"/>
+            <w:tcBorders>
+              <w:top w:val="single" w:color="888888" w:sz="1"/>
+              <w:left w:val="single" w:color="888888" w:sz="1"/>
+              <w:bottom w:val="single" w:color="888888" w:sz="1"/>
+              <w:right w:val="single" w:color="888888" w:sz="1"/>
+            </w:tcBorders>
+            <w:tcMar>
+              <w:top w:type="dxa" w:w="60"/>
+              <w:left w:type="dxa" w:w="110"/>
+              <w:bottom w:type="dxa" w:w="60"/>
+              <w:right w:type="dxa" w:w="110"/>
+            </w:tcMar>
+          </w:tcPr>
+          <w:p>
+            <w:pPr>
+              <w:spacing w:after="0" w:line="280"/>
+            </w:pPr>
+            <w:r>
+              <w:rPr>
+                <w:rFonts w:ascii="Arial" w:cs="Arial" w:eastAsia="Arial" w:hAnsi="Arial"/>
+                <w:b w:val="false"/>
+                <w:bCs w:val="false"/>
+                <w:color w:val="000000"/>
+                <w:sz w:val="21"/>
+                <w:szCs w:val="21"/>
+              </w:rPr>
+              <w:t xml:space="preserve">12 · Tomas Giampaoletti</w:t>
+            </w:r>
+          </w:p>
+        </w:tc>
+        <w:tc>
+          <w:tcPr>
+            <w:tcW w:type="dxa" w:w="2150"/>
+            <w:tcBorders>
+              <w:top w:val="single" w:color="888888" w:sz="1"/>
+              <w:left w:val="single" w:color="888888" w:sz="1"/>
+              <w:bottom w:val="single" w:color="888888" w:sz="1"/>
+              <w:right w:val="single" w:color="888888" w:sz="1"/>
+            </w:tcBorders>
+            <w:tcMar>
+              <w:top w:type="dxa" w:w="60"/>
+              <w:left w:type="dxa" w:w="110"/>
+              <w:bottom w:type="dxa" w:w="60"/>
+              <w:right w:type="dxa" w:w="110"/>
+            </w:tcMar>
+          </w:tcPr>
+          <w:p>
+            <w:pPr>
+              <w:spacing w:after="0" w:line="280"/>
+            </w:pPr>
+            <w:r>
+              <w:rPr>
+                <w:rFonts w:ascii="Arial" w:cs="Arial" w:eastAsia="Arial" w:hAnsi="Arial"/>
+                <w:b w:val="false"/>
+                <w:bCs w:val="false"/>
+                <w:color w:val="000000"/>
+                <w:sz w:val="21"/>
+                <w:szCs w:val="21"/>
+              </w:rPr>
+              <w:t xml:space="preserve">Running + gimnasio; entrenador híbrido y nutricionista hace 1 mes; sumó club de running</w:t>
+            </w:r>
+          </w:p>
+        </w:tc>
+        <w:tc>
+          <w:tcPr>
+            <w:tcW w:type="dxa" w:w="2454"/>
+            <w:tcBorders>
+              <w:top w:val="single" w:color="888888" w:sz="1"/>
+              <w:left w:val="single" w:color="888888" w:sz="1"/>
+              <w:bottom w:val="single" w:color="888888" w:sz="1"/>
+              <w:right w:val="single" w:color="888888" w:sz="1"/>
+            </w:tcBorders>
+            <w:tcMar>
+              <w:top w:type="dxa" w:w="60"/>
+              <w:left w:type="dxa" w:w="110"/>
+              <w:bottom w:type="dxa" w:w="60"/>
+              <w:right w:type="dxa" w:w="110"/>
+            </w:tcMar>
+          </w:tcPr>
+          <w:p>
+            <w:pPr>
+              <w:spacing w:after="0" w:line="280"/>
+            </w:pPr>
+            <w:r>
+              <w:rPr>
+                <w:rFonts w:ascii="Arial" w:cs="Arial" w:eastAsia="Arial" w:hAnsi="Arial"/>
+                <w:b w:val="false"/>
+                <w:bCs w:val="false"/>
+                <w:color w:val="000000"/>
+                <w:sz w:val="21"/>
+                <w:szCs w:val="21"/>
+              </w:rPr>
+              <w:t xml:space="preserve">Buscó un entrenador para unificar running y gimnasio de forma coherente; plan con períodos de carga y descarga</w:t>
+            </w:r>
+          </w:p>
+        </w:tc>
+        <w:tc>
+          <w:tcPr>
+            <w:tcW w:type="dxa" w:w="2000"/>
+            <w:tcBorders>
+              <w:top w:val="single" w:color="888888" w:sz="1"/>
+              <w:left w:val="single" w:color="888888" w:sz="1"/>
+              <w:bottom w:val="single" w:color="888888" w:sz="1"/>
+              <w:right w:val="single" w:color="888888" w:sz="1"/>
+            </w:tcBorders>
+            <w:tcMar>
+              <w:top w:type="dxa" w:w="60"/>
+              <w:left w:type="dxa" w:w="110"/>
+              <w:bottom w:type="dxa" w:w="60"/>
+              <w:right w:type="dxa" w:w="110"/>
+            </w:tcMar>
+          </w:tcPr>
+          <w:p>
+            <w:pPr>
+              <w:spacing w:after="0" w:line="280"/>
+            </w:pPr>
+            <w:r>
+              <w:rPr>
+                <w:rFonts w:ascii="Arial" w:cs="Arial" w:eastAsia="Arial" w:hAnsi="Arial"/>
+                <w:b w:val="false"/>
+                <w:bCs w:val="false"/>
+                <w:color w:val="000000"/>
+                <w:sz w:val="21"/>
+                <w:szCs w:val="21"/>
+              </w:rPr>
+              <w:t xml:space="preserve">Pide que la app se adelante a las decisiones (no solo reaccionar) y no sume carga cognitiva; ya usa IA para ordenar comida y métricas</w:t>
+            </w:r>
+          </w:p>
+        </w:tc>
+      </w:tr>
+      <w:tr>
+        <w:trPr>
+          <w:tblHeader w:val="false"/>
+        </w:trPr>
+        <w:tc>
+          <w:tcPr>
+            <w:tcW w:type="dxa" w:w="1900"/>
+            <w:tcBorders>
+              <w:top w:val="single" w:color="888888" w:sz="1"/>
+              <w:left w:val="single" w:color="888888" w:sz="1"/>
+              <w:bottom w:val="single" w:color="888888" w:sz="1"/>
+              <w:right w:val="single" w:color="888888" w:sz="1"/>
+            </w:tcBorders>
+            <w:tcMar>
+              <w:top w:type="dxa" w:w="60"/>
+              <w:left w:type="dxa" w:w="110"/>
+              <w:bottom w:type="dxa" w:w="60"/>
+              <w:right w:type="dxa" w:w="110"/>
+            </w:tcMar>
+          </w:tcPr>
+          <w:p>
+            <w:pPr>
+              <w:spacing w:after="0" w:line="280"/>
+            </w:pPr>
+            <w:r>
+              <w:rPr>
+                <w:rFonts w:ascii="Arial" w:cs="Arial" w:eastAsia="Arial" w:hAnsi="Arial"/>
+                <w:b w:val="false"/>
+                <w:bCs w:val="false"/>
+                <w:color w:val="000000"/>
+                <w:sz w:val="21"/>
+                <w:szCs w:val="21"/>
+              </w:rPr>
+              <w:t xml:space="preserve">13 · Amparo Atalah</w:t>
+            </w:r>
+          </w:p>
+        </w:tc>
+        <w:tc>
+          <w:tcPr>
+            <w:tcW w:type="dxa" w:w="2150"/>
+            <w:tcBorders>
+              <w:top w:val="single" w:color="888888" w:sz="1"/>
+              <w:left w:val="single" w:color="888888" w:sz="1"/>
+              <w:bottom w:val="single" w:color="888888" w:sz="1"/>
+              <w:right w:val="single" w:color="888888" w:sz="1"/>
+            </w:tcBorders>
+            <w:tcMar>
+              <w:top w:type="dxa" w:w="60"/>
+              <w:left w:type="dxa" w:w="110"/>
+              <w:bottom w:type="dxa" w:w="60"/>
+              <w:right w:type="dxa" w:w="110"/>
+            </w:tcMar>
+          </w:tcPr>
+          <w:p>
+            <w:pPr>
+              <w:spacing w:after="0" w:line="280"/>
+            </w:pPr>
+            <w:r>
+              <w:rPr>
+                <w:rFonts w:ascii="Arial" w:cs="Arial" w:eastAsia="Arial" w:hAnsi="Arial"/>
+                <w:b w:val="false"/>
+                <w:bCs w:val="false"/>
+                <w:color w:val="000000"/>
+                <w:sz w:val="21"/>
+                <w:szCs w:val="21"/>
+              </w:rPr>
+              <w:t xml:space="preserve">Pilates (clases grupales) y fútbol; sin wearable; sin plan propio</w:t>
+            </w:r>
+          </w:p>
+        </w:tc>
+        <w:tc>
+          <w:tcPr>
+            <w:tcW w:type="dxa" w:w="2454"/>
+            <w:tcBorders>
+              <w:top w:val="single" w:color="888888" w:sz="1"/>
+              <w:left w:val="single" w:color="888888" w:sz="1"/>
+              <w:bottom w:val="single" w:color="888888" w:sz="1"/>
+              <w:right w:val="single" w:color="888888" w:sz="1"/>
+            </w:tcBorders>
+            <w:tcMar>
+              <w:top w:type="dxa" w:w="60"/>
+              <w:left w:type="dxa" w:w="110"/>
+              <w:bottom w:type="dxa" w:w="60"/>
+              <w:right w:type="dxa" w:w="110"/>
+            </w:tcMar>
+          </w:tcPr>
+          <w:p>
+            <w:pPr>
+              <w:spacing w:after="0" w:line="280"/>
+            </w:pPr>
+            <w:r>
+              <w:rPr>
+                <w:rFonts w:ascii="Arial" w:cs="Arial" w:eastAsia="Arial" w:hAnsi="Arial"/>
+                <w:b w:val="false"/>
+                <w:bCs w:val="false"/>
+                <w:color w:val="000000"/>
+                <w:sz w:val="21"/>
+                <w:szCs w:val="21"/>
+              </w:rPr>
+              <w:t xml:space="preserve">Delega 100% a la clase; decide intensidad según la energía del día; no tiene seguimiento de progreso</w:t>
+            </w:r>
+          </w:p>
+        </w:tc>
+        <w:tc>
+          <w:tcPr>
+            <w:tcW w:type="dxa" w:w="2000"/>
+            <w:tcBorders>
+              <w:top w:val="single" w:color="888888" w:sz="1"/>
+              <w:left w:val="single" w:color="888888" w:sz="1"/>
+              <w:bottom w:val="single" w:color="888888" w:sz="1"/>
+              <w:right w:val="single" w:color="888888" w:sz="1"/>
+            </w:tcBorders>
+            <w:tcMar>
+              <w:top w:type="dxa" w:w="60"/>
+              <w:left w:type="dxa" w:w="110"/>
+              <w:bottom w:type="dxa" w:w="60"/>
+              <w:right w:type="dxa" w:w="110"/>
+            </w:tcMar>
+          </w:tcPr>
+          <w:p>
+            <w:pPr>
+              <w:spacing w:after="0" w:line="280"/>
+            </w:pPr>
+            <w:r>
+              <w:rPr>
+                <w:rFonts w:ascii="Arial" w:cs="Arial" w:eastAsia="Arial" w:hAnsi="Arial"/>
+                <w:b w:val="false"/>
+                <w:bCs w:val="false"/>
+                <w:color w:val="000000"/>
+                <w:sz w:val="21"/>
+                <w:szCs w:val="21"/>
+              </w:rPr>
+              <w:t xml:space="preserve">Pediría que la app le diga qué comer y cómo entrenar para llegar al objetivo; desconfiaría si no es “profesional” o solo repite lo que ella carga</w:t>
+            </w:r>
+          </w:p>
+        </w:tc>
+      </w:tr>
     </w:tbl>
     <w:p>
       <w:pPr>
@@ -5122,6 +5944,80 @@
     </w:p>
     <w:p>
       <w:pPr>
+        <w:pStyle w:val="ListParagraph"/>
+        <w:numPr>
+          <w:ilvl w:val="0"/>
+          <w:numId w:val="2"/>
+        </w:numPr>
+        <w:spacing w:after="100" w:line="340"/>
+        <w:jc w:val="both"/>
+      </w:pPr>
+      <w:r>
+        <w:rPr>
+          <w:rFonts w:ascii="Arial" w:cs="Arial" w:eastAsia="Arial" w:hAnsi="Arial"/>
+          <w:b/>
+          <w:bCs/>
+          <w:i w:val="false"/>
+          <w:iCs w:val="false"/>
+          <w:color w:val="000000"/>
+          <w:sz w:val="24"/>
+          <w:szCs w:val="24"/>
+        </w:rPr>
+        <w:t xml:space="preserve">La fricción real no es la falta de datos, es integrarlos. </w:t>
+      </w:r>
+      <w:r>
+        <w:rPr>
+          <w:rFonts w:ascii="Arial" w:cs="Arial" w:eastAsia="Arial" w:hAnsi="Arial"/>
+          <w:b w:val="false"/>
+          <w:bCs w:val="false"/>
+          <w:i w:val="false"/>
+          <w:iCs w:val="false"/>
+          <w:color w:val="000000"/>
+          <w:sz w:val="24"/>
+          <w:szCs w:val="24"/>
+        </w:rPr>
+        <w:t xml:space="preserve">Los dos usuarios más avanzados en wearables (Matías, Hernán) ya tienen los datos pero deben cruzarlos manualmente o subir capturas de pantalla a un chat de IA para interpretarlos. El valor de Scala está en resolver esa integración automáticamente, no en agregar otro dashboard.</w:t>
+      </w:r>
+    </w:p>
+    <w:p>
+      <w:pPr>
+        <w:pStyle w:val="ListParagraph"/>
+        <w:numPr>
+          <w:ilvl w:val="0"/>
+          <w:numId w:val="2"/>
+        </w:numPr>
+        <w:spacing w:after="100" w:line="340"/>
+        <w:jc w:val="both"/>
+      </w:pPr>
+      <w:r>
+        <w:rPr>
+          <w:rFonts w:ascii="Arial" w:cs="Arial" w:eastAsia="Arial" w:hAnsi="Arial"/>
+          <w:b/>
+          <w:bCs/>
+          <w:i w:val="false"/>
+          <w:iCs w:val="false"/>
+          <w:color w:val="000000"/>
+          <w:sz w:val="24"/>
+          <w:szCs w:val="24"/>
+        </w:rPr>
+        <w:t xml:space="preserve">Para parte del segmento, la IA debe organizar sin reemplazar el vínculo humano. </w:t>
+      </w:r>
+      <w:r>
+        <w:rPr>
+          <w:rFonts w:ascii="Arial" w:cs="Arial" w:eastAsia="Arial" w:hAnsi="Arial"/>
+          <w:b w:val="false"/>
+          <w:bCs w:val="false"/>
+          <w:i w:val="false"/>
+          <w:iCs w:val="false"/>
+          <w:color w:val="000000"/>
+          <w:sz w:val="24"/>
+          <w:szCs w:val="24"/>
+        </w:rPr>
+        <w:t xml:space="preserve">Maitena valora el gimnasio como desconexión y el vínculo con su coach (nombre, charla, comunidad) y no reemplazaría eso por una IA; pero sí usaría una capa de organización (agenda, comidas, recordatorios, lista de compras) que hoy nadie le resuelve. Reposiciona a Scala como orquestador del "macro", no siempre como sustituto del coach.</w:t>
+      </w:r>
+    </w:p>
+    <w:p>
+      <w:pPr>
         <w:pStyle w:val="Heading1"/>
         <w:keepNext/>
         <w:spacing w:after="80" w:before="300" w:line="340"/>
@@ -5155,7 +6051,7 @@
           <w:sz w:val="24"/>
           <w:szCs w:val="24"/>
         </w:rPr>
-        <w:t xml:space="preserve">Completar al menos 8 entrevistas adicionales hasta llegar a 15 B2C, cuidando las cuotas (más running/ciclismo, ≥5 mujeres ya cubiertas, 2–3 usuarios reales de Scala) y sumar las 2 entrevistas a influencers (GTM).</w:t>
+        <w:t xml:space="preserve">Completar al menos 2 entrevistas adicionales hasta llegar a 15 B2C, cuidando las cuotas (perfiles ya bien cubiertos en running/ciclismo y fuerza/gimnasio; sumar 2–3 usuarios reales de Scala) y sumar las 2 entrevistas a influencers (GTM).</w:t>
       </w:r>
     </w:p>
     <w:p>
@@ -5260,7 +6156,7 @@
           <w:sz w:val="24"/>
           <w:szCs w:val="24"/>
         </w:rPr>
-        <w:t xml:space="preserve">Documento de trabajo provisorio. Fuentes: 7 entrevistas (Notion · Módulo 3 — Entrevistas) y encuesta "Cómo entrenás y tomás tus decisiones" (60 respuestas).</w:t>
+        <w:t xml:space="preserve">Documento de trabajo provisorio. Fuentes: 13 entrevistas (Notion · Módulo 3 — Entrevistas) y encuesta "Cómo entrenás y tomás tus decisiones" (60 respuestas).</w:t>
       </w:r>
     </w:p>
     <w:sectPr>

</xml_diff>